<commit_message>
TechBF DC: Entgelt verweist auf Angebot (Anhang 4), Anlagenverzeichnis ergaenzt
Entgelt-Paragraph verweist jetzt auf das beigefuegte Angebot statt auf die Summe; Anhang 4 - Angebot im Anlagenverzeichnis ergaenzt, 5.x-Nummerierung bereinigt.

Co-Authored-By: Claude Sonnet 5.5 <noreply@anthropic.com>
Claude-Session: https://claude.ai/code/session_016nfePLq8XBNUcRWmhYtqk6
</commit_message>
<xml_diff>
--- a/AMBA_VertragTechBetriebsfuehrung_DC - Vorlage.docx
+++ b/AMBA_VertragTechBetriebsfuehrung_DC - Vorlage.docx
@@ -1811,119 +1811,21 @@
           <w:rFonts w:ascii="Barlow" w:hAnsi="Barlow"/>
           <w:color w:val="auto"/>
         </w:rPr>
-        <w:t xml:space="preserve">Das Entgelt beträgt </w:t>
-      </w:r>
-      <w:r>
-        <w:rPr>
-          <w:rFonts w:ascii="Barlow" w:hAnsi="Barlow"/>
-          <w:color w:val="auto"/>
-        </w:rPr>
-        <w:t>1</w:t>
-      </w:r>
-      <w:r>
-        <w:rPr>
-          <w:rFonts w:ascii="Barlow" w:hAnsi="Barlow"/>
-          <w:color w:val="auto"/>
-        </w:rPr>
-        <w:t>0</w:t>
-      </w:r>
-      <w:r>
-        <w:rPr>
-          <w:rFonts w:ascii="Barlow" w:hAnsi="Barlow"/>
-          <w:color w:val="auto"/>
-        </w:rPr>
-        <w:t xml:space="preserve"> </w:t>
-      </w:r>
-      <w:r>
-        <w:rPr>
-          <w:rFonts w:ascii="Barlow" w:hAnsi="Barlow"/>
-          <w:color w:val="auto"/>
-        </w:rPr>
-        <w:t xml:space="preserve">€ </w:t>
-      </w:r>
-      <w:r>
-        <w:rPr>
-          <w:rFonts w:ascii="Barlow" w:hAnsi="Barlow"/>
-          <w:color w:val="auto"/>
-        </w:rPr>
-        <w:t>n</w:t>
-      </w:r>
-      <w:r>
-        <w:rPr>
-          <w:rFonts w:ascii="Barlow" w:hAnsi="Barlow"/>
-          <w:color w:val="auto"/>
-        </w:rPr>
-        <w:t>etto</w:t>
-      </w:r>
-      <w:r>
-        <w:rPr>
-          <w:rFonts w:ascii="Barlow" w:hAnsi="Barlow"/>
-          <w:color w:val="auto"/>
-        </w:rPr>
-        <w:t xml:space="preserve"> </w:t>
-      </w:r>
-      <w:r>
-        <w:rPr>
-          <w:rFonts w:ascii="Barlow" w:hAnsi="Barlow"/>
-          <w:color w:val="auto"/>
-        </w:rPr>
-        <w:t xml:space="preserve">pro Monat </w:t>
-      </w:r>
-      <w:r>
-        <w:rPr>
-          <w:rFonts w:ascii="Barlow" w:hAnsi="Barlow"/>
-          <w:color w:val="auto"/>
-        </w:rPr>
-        <w:t xml:space="preserve">für </w:t>
-      </w:r>
-      <w:r>
-        <w:rPr>
-          <w:rFonts w:ascii="Barlow" w:hAnsi="Barlow"/>
-          <w:color w:val="auto"/>
-        </w:rPr>
-        <w:t>jeden</w:t>
-      </w:r>
-      <w:r>
-        <w:rPr>
-          <w:rFonts w:ascii="Barlow" w:hAnsi="Barlow"/>
-          <w:color w:val="auto"/>
-        </w:rPr>
-        <w:t xml:space="preserve"> AC</w:t>
-      </w:r>
-      <w:r>
-        <w:rPr>
-          <w:rFonts w:ascii="Barlow" w:hAnsi="Barlow"/>
-          <w:color w:val="auto"/>
-        </w:rPr>
-        <w:t>-</w:t>
-      </w:r>
-      <w:r>
-        <w:rPr>
-          <w:rFonts w:ascii="Barlow" w:hAnsi="Barlow"/>
-          <w:color w:val="auto"/>
-        </w:rPr>
-        <w:t>Ladepunkt eines Standortes</w:t>
-      </w:r>
-      <w:r>
-        <w:rPr>
-          <w:rFonts w:ascii="Barlow" w:hAnsi="Barlow"/>
-          <w:color w:val="auto"/>
-        </w:rPr>
-        <w:t xml:space="preserve"> und 40 €</w:t>
-      </w:r>
-      <w:r>
-        <w:rPr>
-          <w:rFonts w:ascii="Barlow" w:hAnsi="Barlow"/>
-          <w:color w:val="auto"/>
-        </w:rPr>
-        <w:t xml:space="preserve"> pro Monat für jeden DC-Ladepunkt</w:t>
-      </w:r>
-      <w:r>
-        <w:rPr>
-          <w:rFonts w:ascii="Barlow" w:hAnsi="Barlow"/>
-          <w:color w:val="auto"/>
-        </w:rPr>
-        <w:t>.</w:t>
+        <w:t>Das Entgelt für die technische Betriebsführung ergibt sich aus dem diesem Vertrag als Anhang</w:t>
+      </w:r>
+      <w:r>
+        <w:rPr>
+          <w:rFonts w:ascii="Barlow" w:hAnsi="Barlow"/>
+          <w:color w:val="auto"/>
+        </w:rPr>
+        <w:t xml:space="preserve"> 4</w:t>
+      </w:r>
+      <w:r>
+        <w:rPr>
+          <w:rFonts w:ascii="Barlow" w:hAnsi="Barlow"/>
+          <w:color w:val="auto"/>
+        </w:rPr>
+        <w:t xml:space="preserve"> beigefügten Angebot.</w:t>
       </w:r>
       <w:r>
         <w:rPr>
@@ -2040,7 +1942,7 @@
           <w:rFonts w:ascii="Barlow" w:hAnsi="Barlow"/>
           <w:color w:val="auto"/>
         </w:rPr>
-        <w:t>3</w:t>
+        <w:t>2</w:t>
       </w:r>
       <w:r>
         <w:rPr>
@@ -2158,7 +2060,7 @@
           <w:rFonts w:ascii="Barlow" w:hAnsi="Barlow"/>
           <w:color w:val="auto"/>
         </w:rPr>
-        <w:t>4</w:t>
+        <w:t>3</w:t>
       </w:r>
       <w:r>
         <w:rPr>
@@ -3759,7 +3661,37 @@
           <w:rFonts w:ascii="Barlow" w:hAnsi="Barlow"/>
           <w:color w:val="auto"/>
         </w:rPr>
-        <w:t>Anhang 3 - Ansprechpartner</w:t>
+        <w:t xml:space="preserve">Anhang 3 </w:t>
+      </w:r>
+      <w:r>
+        <w:rPr>
+          <w:rFonts w:ascii="Barlow" w:hAnsi="Barlow"/>
+          <w:color w:val="auto"/>
+        </w:rPr>
+        <w:t>–</w:t>
+      </w:r>
+      <w:r>
+        <w:rPr>
+          <w:rFonts w:ascii="Barlow" w:hAnsi="Barlow"/>
+          <w:color w:val="auto"/>
+        </w:rPr>
+        <w:t xml:space="preserve"> Ansprechpartner</w:t>
+      </w:r>
+    </w:p>
+    <w:p>
+      <w:pPr>
+        <w:ind w:left="0" w:firstLine="0"/>
+        <w:rPr>
+          <w:rFonts w:ascii="Barlow" w:hAnsi="Barlow"/>
+          <w:color w:val="auto"/>
+        </w:rPr>
+      </w:pPr>
+      <w:r>
+        <w:rPr>
+          <w:rFonts w:ascii="Barlow" w:hAnsi="Barlow"/>
+          <w:color w:val="auto"/>
+        </w:rPr>
+        <w:t>Anhang 4 - Angebot</w:t>
       </w:r>
     </w:p>
     <w:p>
@@ -10751,9 +10683,11 @@
     <w:rsid w:val="00612B12"/>
     <w:rsid w:val="00621118"/>
     <w:rsid w:val="006D442A"/>
+    <w:rsid w:val="00746C47"/>
     <w:rsid w:val="008256A6"/>
     <w:rsid w:val="008706E0"/>
     <w:rsid w:val="0093750C"/>
+    <w:rsid w:val="00A7167E"/>
     <w:rsid w:val="00A84B7D"/>
     <w:rsid w:val="00B3436C"/>
     <w:rsid w:val="00B54527"/>
@@ -11527,10 +11461,6 @@
 </file>
 
 <file path=customXml/item1.xml><?xml version="1.0" encoding="utf-8"?>
-<b:Sources xmlns:b="http://schemas.openxmlformats.org/officeDocument/2006/bibliography" xmlns="http://schemas.openxmlformats.org/officeDocument/2006/bibliography" SelectedStyle="/APASixthEditionOfficeOnline.xsl" StyleName="APA" Version="6"/>
-</file>
-
-<file path=customXml/item2.xml><?xml version="1.0" encoding="utf-8"?>
 <?mso-contentType ?>
 <FormTemplates xmlns="http://schemas.microsoft.com/sharepoint/v3/contenttype/forms">
   <Display>DocumentLibraryForm</Display>
@@ -11539,7 +11469,22 @@
 </FormTemplates>
 </file>
 
+<file path=customXml/item2.xml><?xml version="1.0" encoding="utf-8"?>
+<b:Sources xmlns:b="http://schemas.openxmlformats.org/officeDocument/2006/bibliography" xmlns="http://schemas.openxmlformats.org/officeDocument/2006/bibliography" SelectedStyle="/APASixthEditionOfficeOnline.xsl" StyleName="APA" Version="6"/>
+</file>
+
 <file path=customXml/item3.xml><?xml version="1.0" encoding="utf-8"?>
+<p:properties xmlns:p="http://schemas.microsoft.com/office/2006/metadata/properties" xmlns:xsi="http://www.w3.org/2001/XMLSchema-instance" xmlns:pc="http://schemas.microsoft.com/office/infopath/2007/PartnerControls">
+  <documentManagement>
+    <lcf76f155ced4ddcb4097134ff3c332f xmlns="8a383c2e-bd54-4902-a119-5b87932b8e96">
+      <Terms xmlns="http://schemas.microsoft.com/office/infopath/2007/PartnerControls"/>
+    </lcf76f155ced4ddcb4097134ff3c332f>
+    <TaxCatchAll xmlns="bb47c008-c9da-4c4d-aa48-f28061b9cf67" xsi:nil="true"/>
+  </documentManagement>
+</p:properties>
+</file>
+
+<file path=customXml/item4.xml><?xml version="1.0" encoding="utf-8"?>
 <ct:contentTypeSchema xmlns:ct="http://schemas.microsoft.com/office/2006/metadata/contentType" xmlns:ma="http://schemas.microsoft.com/office/2006/metadata/properties/metaAttributes" ct:_="" ma:_="" ma:contentTypeName="Dokument" ma:contentTypeID="0x010100F51D2DA3021EF44F8FAF5E03764C10C1" ma:contentTypeVersion="18" ma:contentTypeDescription="Ein neues Dokument erstellen." ma:contentTypeScope="" ma:versionID="3a8fd9c6520108d566a5c297b8e1cf9b">
   <xsd:schema xmlns:xsd="http://www.w3.org/2001/XMLSchema" xmlns:xs="http://www.w3.org/2001/XMLSchema" xmlns:p="http://schemas.microsoft.com/office/2006/metadata/properties" xmlns:ns2="8a383c2e-bd54-4902-a119-5b87932b8e96" xmlns:ns3="bb47c008-c9da-4c4d-aa48-f28061b9cf67" targetNamespace="http://schemas.microsoft.com/office/2006/metadata/properties" ma:root="true" ma:fieldsID="48c64c471ca64ef5032473ebd97cadc3" ns2:_="" ns3:_="">
     <xsd:import namespace="8a383c2e-bd54-4902-a119-5b87932b8e96"/>
@@ -11794,18 +11739,15 @@
 </ct:contentTypeSchema>
 </file>
 
-<file path=customXml/item4.xml><?xml version="1.0" encoding="utf-8"?>
-<p:properties xmlns:p="http://schemas.microsoft.com/office/2006/metadata/properties" xmlns:xsi="http://www.w3.org/2001/XMLSchema-instance" xmlns:pc="http://schemas.microsoft.com/office/infopath/2007/PartnerControls">
-  <documentManagement>
-    <lcf76f155ced4ddcb4097134ff3c332f xmlns="8a383c2e-bd54-4902-a119-5b87932b8e96">
-      <Terms xmlns="http://schemas.microsoft.com/office/infopath/2007/PartnerControls"/>
-    </lcf76f155ced4ddcb4097134ff3c332f>
-    <TaxCatchAll xmlns="bb47c008-c9da-4c4d-aa48-f28061b9cf67" xsi:nil="true"/>
-  </documentManagement>
-</p:properties>
+<file path=customXml/itemProps1.xml><?xml version="1.0" encoding="utf-8"?>
+<ds:datastoreItem xmlns:ds="http://schemas.openxmlformats.org/officeDocument/2006/customXml" ds:itemID="{333D3B4D-C29E-4D36-9A71-0229B8C821CD}">
+  <ds:schemaRefs>
+    <ds:schemaRef ds:uri="http://schemas.microsoft.com/sharepoint/v3/contenttype/forms"/>
+  </ds:schemaRefs>
+</ds:datastoreItem>
 </file>
 
-<file path=customXml/itemProps1.xml><?xml version="1.0" encoding="utf-8"?>
+<file path=customXml/itemProps2.xml><?xml version="1.0" encoding="utf-8"?>
 <ds:datastoreItem xmlns:ds="http://schemas.openxmlformats.org/officeDocument/2006/customXml" ds:itemID="{B9FD68CE-9D6C-D945-98D8-801A35D77419}">
   <ds:schemaRefs>
     <ds:schemaRef ds:uri="http://schemas.openxmlformats.org/officeDocument/2006/bibliography"/>
@@ -11813,15 +11755,18 @@
 </ds:datastoreItem>
 </file>
 
-<file path=customXml/itemProps2.xml><?xml version="1.0" encoding="utf-8"?>
-<ds:datastoreItem xmlns:ds="http://schemas.openxmlformats.org/officeDocument/2006/customXml" ds:itemID="{333D3B4D-C29E-4D36-9A71-0229B8C821CD}">
+<file path=customXml/itemProps3.xml><?xml version="1.0" encoding="utf-8"?>
+<ds:datastoreItem xmlns:ds="http://schemas.openxmlformats.org/officeDocument/2006/customXml" ds:itemID="{CF55B654-1F4F-499E-A6AC-8E5A12F2782C}">
   <ds:schemaRefs>
-    <ds:schemaRef ds:uri="http://schemas.microsoft.com/sharepoint/v3/contenttype/forms"/>
+    <ds:schemaRef ds:uri="http://schemas.microsoft.com/office/2006/metadata/properties"/>
+    <ds:schemaRef ds:uri="http://schemas.microsoft.com/office/infopath/2007/PartnerControls"/>
+    <ds:schemaRef ds:uri="8a383c2e-bd54-4902-a119-5b87932b8e96"/>
+    <ds:schemaRef ds:uri="bb47c008-c9da-4c4d-aa48-f28061b9cf67"/>
   </ds:schemaRefs>
 </ds:datastoreItem>
 </file>
 
-<file path=customXml/itemProps3.xml><?xml version="1.0" encoding="utf-8"?>
+<file path=customXml/itemProps4.xml><?xml version="1.0" encoding="utf-8"?>
 <ds:datastoreItem xmlns:ds="http://schemas.openxmlformats.org/officeDocument/2006/customXml" ds:itemID="{9A2653E7-2455-47C7-A230-8CCB80B07A86}">
   <ds:schemaRefs>
     <ds:schemaRef ds:uri="http://schemas.microsoft.com/office/2006/metadata/contentType"/>
@@ -11838,15 +11783,4 @@
     <ds:schemaRef ds:uri="http://schemas.microsoft.com/internal/obd"/>
   </ds:schemaRefs>
 </ds:datastoreItem>
-</file>
-
-<file path=customXml/itemProps4.xml><?xml version="1.0" encoding="utf-8"?>
-<ds:datastoreItem xmlns:ds="http://schemas.openxmlformats.org/officeDocument/2006/customXml" ds:itemID="{CF55B654-1F4F-499E-A6AC-8E5A12F2782C}">
-  <ds:schemaRefs>
-    <ds:schemaRef ds:uri="http://schemas.microsoft.com/office/2006/metadata/properties"/>
-    <ds:schemaRef ds:uri="http://schemas.microsoft.com/office/infopath/2007/PartnerControls"/>
-    <ds:schemaRef ds:uri="8a383c2e-bd54-4902-a119-5b87932b8e96"/>
-    <ds:schemaRef ds:uri="bb47c008-c9da-4c4d-aa48-f28061b9cf67"/>
-  </ds:schemaRefs>
-</ds:datastoreItem>
 </file>
</xml_diff>